<commit_message>
docs: sync setup guide [I-00]
</commit_message>
<xml_diff>
--- a/docs/ESP32_Project_Setup_Guide.docx
+++ b/docs/ESP32_Project_Setup_Guide.docx
@@ -51,7 +51,6 @@
         <w:t xml:space="preserve"> (</w:t>
       </w:r>
       <w:proofErr w:type="spellStart"/>
-      <w:proofErr w:type="gramStart"/>
       <w:r>
         <w:rPr>
           <w:color w:val="595959"/>
@@ -61,7 +60,6 @@
         <w:t>wokwi.toml</w:t>
       </w:r>
       <w:proofErr w:type="spellEnd"/>
-      <w:proofErr w:type="gramEnd"/>
       <w:r>
         <w:rPr>
           <w:color w:val="595959"/>
@@ -71,7 +69,6 @@
         <w:t xml:space="preserve"> + </w:t>
       </w:r>
       <w:proofErr w:type="spellStart"/>
-      <w:proofErr w:type="gramStart"/>
       <w:r>
         <w:rPr>
           <w:color w:val="595959"/>
@@ -81,7 +78,6 @@
         <w:t>diagram.json</w:t>
       </w:r>
       <w:proofErr w:type="spellEnd"/>
-      <w:proofErr w:type="gramEnd"/>
       <w:r>
         <w:rPr>
           <w:color w:val="595959"/>
@@ -209,15 +205,7 @@
         <w:t>VS Code:</w:t>
       </w:r>
       <w:r>
-        <w:t xml:space="preserve"> </w:t>
-      </w:r>
-      <w:proofErr w:type="gramStart"/>
-      <w:r>
-        <w:t>the</w:t>
-      </w:r>
-      <w:proofErr w:type="gramEnd"/>
-      <w:r>
-        <w:t xml:space="preserve"> </w:t>
+        <w:t xml:space="preserve"> the </w:t>
       </w:r>
       <w:proofErr w:type="spellStart"/>
       <w:r>
@@ -258,12 +246,6 @@
         <w:gridCol w:w="7038"/>
       </w:tblGrid>
       <w:tr>
-        <w:tblPrEx>
-          <w:tblCellMar>
-            <w:top w:w="0" w:type="dxa"/>
-            <w:bottom w:w="0" w:type="dxa"/>
-          </w:tblCellMar>
-        </w:tblPrEx>
         <w:trPr>
           <w:tblHeader/>
         </w:trPr>
@@ -333,12 +315,6 @@
         </w:tc>
       </w:tr>
       <w:tr>
-        <w:tblPrEx>
-          <w:tblCellMar>
-            <w:top w:w="0" w:type="dxa"/>
-            <w:bottom w:w="0" w:type="dxa"/>
-          </w:tblCellMar>
-        </w:tblPrEx>
         <w:tc>
           <w:tcPr>
             <w:tcW w:w="2600" w:type="dxa"/>
@@ -408,12 +384,6 @@
         </w:tc>
       </w:tr>
       <w:tr>
-        <w:tblPrEx>
-          <w:tblCellMar>
-            <w:top w:w="0" w:type="dxa"/>
-            <w:bottom w:w="0" w:type="dxa"/>
-          </w:tblCellMar>
-        </w:tblPrEx>
         <w:tc>
           <w:tcPr>
             <w:tcW w:w="2600" w:type="dxa"/>
@@ -476,12 +446,6 @@
         </w:tc>
       </w:tr>
       <w:tr>
-        <w:tblPrEx>
-          <w:tblCellMar>
-            <w:top w:w="0" w:type="dxa"/>
-            <w:bottom w:w="0" w:type="dxa"/>
-          </w:tblCellMar>
-        </w:tblPrEx>
         <w:tc>
           <w:tcPr>
             <w:tcW w:w="2600" w:type="dxa"/>
@@ -544,12 +508,6 @@
         </w:tc>
       </w:tr>
       <w:tr>
-        <w:tblPrEx>
-          <w:tblCellMar>
-            <w:top w:w="0" w:type="dxa"/>
-            <w:bottom w:w="0" w:type="dxa"/>
-          </w:tblCellMar>
-        </w:tblPrEx>
         <w:tc>
           <w:tcPr>
             <w:tcW w:w="2600" w:type="dxa"/>
@@ -612,12 +570,6 @@
         </w:tc>
       </w:tr>
       <w:tr>
-        <w:tblPrEx>
-          <w:tblCellMar>
-            <w:top w:w="0" w:type="dxa"/>
-            <w:bottom w:w="0" w:type="dxa"/>
-          </w:tblCellMar>
-        </w:tblPrEx>
         <w:tc>
           <w:tcPr>
             <w:tcW w:w="2600" w:type="dxa"/>
@@ -687,12 +639,6 @@
         </w:tc>
       </w:tr>
       <w:tr>
-        <w:tblPrEx>
-          <w:tblCellMar>
-            <w:top w:w="0" w:type="dxa"/>
-            <w:bottom w:w="0" w:type="dxa"/>
-          </w:tblCellMar>
-        </w:tblPrEx>
         <w:tc>
           <w:tcPr>
             <w:tcW w:w="2600" w:type="dxa"/>
@@ -1127,16 +1073,7 @@
           <w:sz w:val="18"/>
           <w:szCs w:val="18"/>
         </w:rPr>
-        <w:t>cat &gt;&gt; ~</w:t>
-      </w:r>
-      <w:proofErr w:type="gramStart"/>
-      <w:r>
-        <w:rPr>
-          <w:rFonts w:ascii="Consolas" w:eastAsia="Consolas" w:hAnsi="Consolas" w:cs="Consolas"/>
-          <w:sz w:val="18"/>
-          <w:szCs w:val="18"/>
-        </w:rPr>
-        <w:t>/.</w:t>
+        <w:t>cat &gt;&gt; ~/.</w:t>
       </w:r>
       <w:proofErr w:type="spellStart"/>
       <w:r>
@@ -1148,7 +1085,6 @@
         <w:t>bashrc</w:t>
       </w:r>
       <w:proofErr w:type="spellEnd"/>
-      <w:proofErr w:type="gramEnd"/>
       <w:r>
         <w:rPr>
           <w:rFonts w:ascii="Consolas" w:eastAsia="Consolas" w:hAnsi="Consolas" w:cs="Consolas"/>
@@ -1168,7 +1104,6 @@
         <w:ind w:left="160" w:right="160"/>
       </w:pPr>
       <w:proofErr w:type="spellStart"/>
-      <w:proofErr w:type="gramStart"/>
       <w:r>
         <w:rPr>
           <w:rFonts w:ascii="Consolas" w:eastAsia="Consolas" w:hAnsi="Consolas" w:cs="Consolas"/>
@@ -1184,16 +1119,7 @@
           <w:sz w:val="18"/>
           <w:szCs w:val="18"/>
         </w:rPr>
-        <w:t>(</w:t>
-      </w:r>
-      <w:proofErr w:type="gramEnd"/>
-      <w:r>
-        <w:rPr>
-          <w:rFonts w:ascii="Consolas" w:eastAsia="Consolas" w:hAnsi="Consolas" w:cs="Consolas"/>
-          <w:sz w:val="18"/>
-          <w:szCs w:val="18"/>
-        </w:rPr>
-        <w:t>) {</w:t>
+        <w:t>() {</w:t>
       </w:r>
     </w:p>
     <w:p>
@@ -1301,16 +1227,7 @@
           <w:sz w:val="18"/>
           <w:szCs w:val="18"/>
         </w:rPr>
-        <w:t>source ~</w:t>
-      </w:r>
-      <w:proofErr w:type="gramStart"/>
-      <w:r>
-        <w:rPr>
-          <w:rFonts w:ascii="Consolas" w:eastAsia="Consolas" w:hAnsi="Consolas" w:cs="Consolas"/>
-          <w:sz w:val="18"/>
-          <w:szCs w:val="18"/>
-        </w:rPr>
-        <w:t>/.</w:t>
+        <w:t>source ~/.</w:t>
       </w:r>
       <w:proofErr w:type="spellStart"/>
       <w:r>
@@ -1322,7 +1239,6 @@
         <w:t>bashrc</w:t>
       </w:r>
       <w:proofErr w:type="spellEnd"/>
-      <w:proofErr w:type="gramEnd"/>
     </w:p>
     <w:p>
       <w:pPr>
@@ -1598,9 +1514,102 @@
           <w:szCs w:val="20"/>
           <w:shd w:val="clear" w:color="auto" w:fill="EDEDED"/>
         </w:rPr>
-        <w:t>compile_</w:t>
-      </w:r>
-      <w:proofErr w:type="gramStart"/>
+        <w:t>compile_commands.json</w:t>
+      </w:r>
+      <w:proofErr w:type="spellEnd"/>
+      <w:r>
+        <w:t xml:space="preserve">). If they linger, run </w:t>
+      </w:r>
+      <w:r>
+        <w:rPr>
+          <w:b/>
+          <w:bCs/>
+        </w:rPr>
+        <w:t xml:space="preserve">ESP-IDF: Add </w:t>
+      </w:r>
+      <w:proofErr w:type="spellStart"/>
+      <w:r>
+        <w:rPr>
+          <w:b/>
+          <w:bCs/>
+        </w:rPr>
+        <w:t>vscode</w:t>
+      </w:r>
+      <w:proofErr w:type="spellEnd"/>
+      <w:r>
+        <w:rPr>
+          <w:b/>
+          <w:bCs/>
+        </w:rPr>
+        <w:t xml:space="preserve"> configuration folder</w:t>
+      </w:r>
+      <w:r>
+        <w:t xml:space="preserve">, then </w:t>
+      </w:r>
+      <w:r>
+        <w:rPr>
+          <w:b/>
+          <w:bCs/>
+        </w:rPr>
+        <w:t>Developer: Reload Window</w:t>
+      </w:r>
+      <w:r>
+        <w:t>.</w:t>
+      </w:r>
+    </w:p>
+    <w:p>
+      <w:pPr>
+        <w:spacing w:after="60" w:line="360" w:lineRule="auto"/>
+      </w:pPr>
+      <w:r>
+        <w:t xml:space="preserve">VSCODE </w:t>
+      </w:r>
+      <w:proofErr w:type="spellStart"/>
+      <w:r>
+        <w:t>Intellisense</w:t>
+      </w:r>
+      <w:proofErr w:type="spellEnd"/>
+      <w:r>
+        <w:t xml:space="preserve"> Failure.</w:t>
+      </w:r>
+    </w:p>
+    <w:p>
+      <w:pPr>
+        <w:spacing w:after="60" w:line="360" w:lineRule="auto"/>
+      </w:pPr>
+      <w:r>
+        <w:t xml:space="preserve">Pres Ctrl + Shift +P :Then enter </w:t>
+      </w:r>
+      <w:r>
+        <w:t xml:space="preserve">ESP-IDF: Add </w:t>
+      </w:r>
+      <w:proofErr w:type="spellStart"/>
+      <w:r>
+        <w:t>vscode</w:t>
+      </w:r>
+      <w:proofErr w:type="spellEnd"/>
+      <w:r>
+        <w:t xml:space="preserve"> configuration folder</w:t>
+      </w:r>
+    </w:p>
+    <w:p>
+      <w:pPr>
+        <w:spacing w:after="120" w:line="360" w:lineRule="auto"/>
+      </w:pPr>
+      <w:r>
+        <w:lastRenderedPageBreak/>
+        <w:t>Inside VS Code's ESP-IDF terminal (</w:t>
+      </w:r>
+      <w:r>
+        <w:rPr>
+          <w:b/>
+          <w:bCs/>
+        </w:rPr>
+        <w:t>ESP-IDF: Open ESP-IDF Terminal</w:t>
+      </w:r>
+      <w:r>
+        <w:t xml:space="preserve">) the environment is already active, so type </w:t>
+      </w:r>
       <w:r>
         <w:rPr>
           <w:rFonts w:ascii="Consolas" w:eastAsia="Consolas" w:hAnsi="Consolas" w:cs="Consolas"/>
@@ -1608,67 +1617,12 @@
           <w:szCs w:val="20"/>
           <w:shd w:val="clear" w:color="auto" w:fill="EDEDED"/>
         </w:rPr>
-        <w:t>commands.json</w:t>
-      </w:r>
-      <w:proofErr w:type="spellEnd"/>
-      <w:proofErr w:type="gramEnd"/>
-      <w:r>
-        <w:t xml:space="preserve">). If they linger, run </w:t>
-      </w:r>
-      <w:r>
-        <w:rPr>
-          <w:b/>
-          <w:bCs/>
-        </w:rPr>
-        <w:t xml:space="preserve">ESP-IDF: Add </w:t>
-      </w:r>
-      <w:proofErr w:type="spellStart"/>
-      <w:r>
-        <w:rPr>
-          <w:b/>
-          <w:bCs/>
-        </w:rPr>
-        <w:t>vscode</w:t>
-      </w:r>
-      <w:proofErr w:type="spellEnd"/>
-      <w:r>
-        <w:rPr>
-          <w:b/>
-          <w:bCs/>
-        </w:rPr>
-        <w:t xml:space="preserve"> configuration folder</w:t>
-      </w:r>
-      <w:r>
-        <w:t xml:space="preserve">, then </w:t>
-      </w:r>
-      <w:r>
-        <w:rPr>
-          <w:b/>
-          <w:bCs/>
-        </w:rPr>
-        <w:t>Developer: Reload Window</w:t>
-      </w:r>
-      <w:r>
-        <w:t>.</w:t>
-      </w:r>
-    </w:p>
-    <w:p>
-      <w:pPr>
-        <w:spacing w:after="120" w:line="360" w:lineRule="auto"/>
-      </w:pPr>
-      <w:r>
-        <w:t>Inside VS Code's ESP-IDF terminal (</w:t>
-      </w:r>
-      <w:r>
-        <w:rPr>
-          <w:b/>
-          <w:bCs/>
-        </w:rPr>
-        <w:t>ESP-IDF: Open ESP-IDF Terminal</w:t>
-      </w:r>
-      <w:r>
-        <w:t xml:space="preserve">) the environment is already active, so type </w:t>
-      </w:r>
+        <w:t>idf.py</w:t>
+      </w:r>
+      <w:r>
+        <w:t xml:space="preserve"> there, not </w:t>
+      </w:r>
+      <w:proofErr w:type="spellStart"/>
       <w:r>
         <w:rPr>
           <w:rFonts w:ascii="Consolas" w:eastAsia="Consolas" w:hAnsi="Consolas" w:cs="Consolas"/>
@@ -1676,19 +1630,6 @@
           <w:szCs w:val="20"/>
           <w:shd w:val="clear" w:color="auto" w:fill="EDEDED"/>
         </w:rPr>
-        <w:t>idf.py</w:t>
-      </w:r>
-      <w:r>
-        <w:t xml:space="preserve"> there, not </w:t>
-      </w:r>
-      <w:proofErr w:type="spellStart"/>
-      <w:r>
-        <w:rPr>
-          <w:rFonts w:ascii="Consolas" w:eastAsia="Consolas" w:hAnsi="Consolas" w:cs="Consolas"/>
-          <w:sz w:val="20"/>
-          <w:szCs w:val="20"/>
-          <w:shd w:val="clear" w:color="auto" w:fill="EDEDED"/>
-        </w:rPr>
         <w:t>idf</w:t>
       </w:r>
       <w:proofErr w:type="spellEnd"/>
@@ -1702,7 +1643,6 @@
         <w:spacing w:line="360" w:lineRule="auto"/>
       </w:pPr>
       <w:r>
-        <w:lastRenderedPageBreak/>
         <w:t xml:space="preserve">2.6 Activate </w:t>
       </w:r>
       <w:proofErr w:type="spellStart"/>
@@ -1876,23 +1816,13 @@
         <w:spacing w:line="360" w:lineRule="auto"/>
         <w:ind w:left="160" w:right="160"/>
       </w:pPr>
-      <w:proofErr w:type="gramStart"/>
-      <w:r>
-        <w:rPr>
-          <w:rFonts w:ascii="Consolas" w:eastAsia="Consolas" w:hAnsi="Consolas" w:cs="Consolas"/>
-          <w:sz w:val="18"/>
-          <w:szCs w:val="18"/>
-        </w:rPr>
-        <w:t>code .</w:t>
-      </w:r>
-      <w:proofErr w:type="gramEnd"/>
-      <w:r>
-        <w:rPr>
-          <w:rFonts w:ascii="Consolas" w:eastAsia="Consolas" w:hAnsi="Consolas" w:cs="Consolas"/>
-          <w:sz w:val="18"/>
-          <w:szCs w:val="18"/>
-        </w:rPr>
-        <w:t xml:space="preserve">                  # open in VS Code</w:t>
+      <w:r>
+        <w:rPr>
+          <w:rFonts w:ascii="Consolas" w:eastAsia="Consolas" w:hAnsi="Consolas" w:cs="Consolas"/>
+          <w:sz w:val="18"/>
+          <w:szCs w:val="18"/>
+        </w:rPr>
+        <w:t>code .                  # open in VS Code</w:t>
       </w:r>
     </w:p>
     <w:p>
@@ -2025,25 +1955,7 @@
           <w:sz w:val="18"/>
           <w:szCs w:val="18"/>
         </w:rPr>
-        <w:t>/examples/get-started/</w:t>
-      </w:r>
-      <w:proofErr w:type="gramStart"/>
-      <w:r>
-        <w:rPr>
-          <w:rFonts w:ascii="Consolas" w:eastAsia="Consolas" w:hAnsi="Consolas" w:cs="Consolas"/>
-          <w:sz w:val="18"/>
-          <w:szCs w:val="18"/>
-        </w:rPr>
-        <w:t>blink .</w:t>
-      </w:r>
-      <w:proofErr w:type="gramEnd"/>
-      <w:r>
-        <w:rPr>
-          <w:rFonts w:ascii="Consolas" w:eastAsia="Consolas" w:hAnsi="Consolas" w:cs="Consolas"/>
-          <w:sz w:val="18"/>
-          <w:szCs w:val="18"/>
-        </w:rPr>
-        <w:t>/</w:t>
+        <w:t>/examples/get-started/blink ./</w:t>
       </w:r>
       <w:proofErr w:type="spellStart"/>
       <w:r>
@@ -2493,34 +2405,16 @@
           <w:sz w:val="18"/>
           <w:szCs w:val="18"/>
         </w:rPr>
-        <w:t>gpio_reset_</w:t>
-      </w:r>
-      <w:proofErr w:type="gramStart"/>
-      <w:r>
-        <w:rPr>
-          <w:rFonts w:ascii="Consolas" w:eastAsia="Consolas" w:hAnsi="Consolas" w:cs="Consolas"/>
-          <w:sz w:val="18"/>
-          <w:szCs w:val="18"/>
-        </w:rPr>
-        <w:t>pin</w:t>
-      </w:r>
-      <w:proofErr w:type="spellEnd"/>
-      <w:r>
-        <w:rPr>
-          <w:rFonts w:ascii="Consolas" w:eastAsia="Consolas" w:hAnsi="Consolas" w:cs="Consolas"/>
-          <w:sz w:val="18"/>
-          <w:szCs w:val="18"/>
-        </w:rPr>
-        <w:t>(</w:t>
-      </w:r>
-      <w:proofErr w:type="gramEnd"/>
-      <w:r>
-        <w:rPr>
-          <w:rFonts w:ascii="Consolas" w:eastAsia="Consolas" w:hAnsi="Consolas" w:cs="Consolas"/>
-          <w:sz w:val="18"/>
-          <w:szCs w:val="18"/>
-        </w:rPr>
-        <w:t>LED_GPIO);</w:t>
+        <w:t>gpio_reset_pin</w:t>
+      </w:r>
+      <w:proofErr w:type="spellEnd"/>
+      <w:r>
+        <w:rPr>
+          <w:rFonts w:ascii="Consolas" w:eastAsia="Consolas" w:hAnsi="Consolas" w:cs="Consolas"/>
+          <w:sz w:val="18"/>
+          <w:szCs w:val="18"/>
+        </w:rPr>
+        <w:t>(LED_GPIO);</w:t>
       </w:r>
     </w:p>
     <w:p>
@@ -2538,6 +2432,7 @@
           <w:sz w:val="18"/>
           <w:szCs w:val="18"/>
         </w:rPr>
+        <w:lastRenderedPageBreak/>
         <w:t xml:space="preserve">    </w:t>
       </w:r>
       <w:proofErr w:type="spellStart"/>
@@ -2547,34 +2442,16 @@
           <w:sz w:val="18"/>
           <w:szCs w:val="18"/>
         </w:rPr>
-        <w:t>gpio_set_</w:t>
-      </w:r>
-      <w:proofErr w:type="gramStart"/>
-      <w:r>
-        <w:rPr>
-          <w:rFonts w:ascii="Consolas" w:eastAsia="Consolas" w:hAnsi="Consolas" w:cs="Consolas"/>
-          <w:sz w:val="18"/>
-          <w:szCs w:val="18"/>
-        </w:rPr>
-        <w:t>direction</w:t>
-      </w:r>
-      <w:proofErr w:type="spellEnd"/>
-      <w:r>
-        <w:rPr>
-          <w:rFonts w:ascii="Consolas" w:eastAsia="Consolas" w:hAnsi="Consolas" w:cs="Consolas"/>
-          <w:sz w:val="18"/>
-          <w:szCs w:val="18"/>
-        </w:rPr>
-        <w:t>(</w:t>
-      </w:r>
-      <w:proofErr w:type="gramEnd"/>
-      <w:r>
-        <w:rPr>
-          <w:rFonts w:ascii="Consolas" w:eastAsia="Consolas" w:hAnsi="Consolas" w:cs="Consolas"/>
-          <w:sz w:val="18"/>
-          <w:szCs w:val="18"/>
-        </w:rPr>
-        <w:t>LED_GPIO, GPIO_MODE_OUTPUT);</w:t>
+        <w:t>gpio_set_direction</w:t>
+      </w:r>
+      <w:proofErr w:type="spellEnd"/>
+      <w:r>
+        <w:rPr>
+          <w:rFonts w:ascii="Consolas" w:eastAsia="Consolas" w:hAnsi="Consolas" w:cs="Consolas"/>
+          <w:sz w:val="18"/>
+          <w:szCs w:val="18"/>
+        </w:rPr>
+        <w:t>(LED_GPIO, GPIO_MODE_OUTPUT);</w:t>
       </w:r>
     </w:p>
     <w:p>
@@ -2619,34 +2496,16 @@
           <w:sz w:val="18"/>
           <w:szCs w:val="18"/>
         </w:rPr>
-        <w:t>gpio_set_</w:t>
-      </w:r>
-      <w:proofErr w:type="gramStart"/>
-      <w:r>
-        <w:rPr>
-          <w:rFonts w:ascii="Consolas" w:eastAsia="Consolas" w:hAnsi="Consolas" w:cs="Consolas"/>
-          <w:sz w:val="18"/>
-          <w:szCs w:val="18"/>
-        </w:rPr>
-        <w:t>level</w:t>
-      </w:r>
-      <w:proofErr w:type="spellEnd"/>
-      <w:r>
-        <w:rPr>
-          <w:rFonts w:ascii="Consolas" w:eastAsia="Consolas" w:hAnsi="Consolas" w:cs="Consolas"/>
-          <w:sz w:val="18"/>
-          <w:szCs w:val="18"/>
-        </w:rPr>
-        <w:t>(</w:t>
-      </w:r>
-      <w:proofErr w:type="gramEnd"/>
-      <w:r>
-        <w:rPr>
-          <w:rFonts w:ascii="Consolas" w:eastAsia="Consolas" w:hAnsi="Consolas" w:cs="Consolas"/>
-          <w:sz w:val="18"/>
-          <w:szCs w:val="18"/>
-        </w:rPr>
-        <w:t>LED_GPIO, 1);</w:t>
+        <w:t>gpio_set_level</w:t>
+      </w:r>
+      <w:proofErr w:type="spellEnd"/>
+      <w:r>
+        <w:rPr>
+          <w:rFonts w:ascii="Consolas" w:eastAsia="Consolas" w:hAnsi="Consolas" w:cs="Consolas"/>
+          <w:sz w:val="18"/>
+          <w:szCs w:val="18"/>
+        </w:rPr>
+        <w:t>(LED_GPIO, 1);</w:t>
       </w:r>
     </w:p>
     <w:p>
@@ -2691,34 +2550,16 @@
           <w:sz w:val="18"/>
           <w:szCs w:val="18"/>
         </w:rPr>
-        <w:t>pdMS_TO_</w:t>
-      </w:r>
-      <w:proofErr w:type="gramStart"/>
-      <w:r>
-        <w:rPr>
-          <w:rFonts w:ascii="Consolas" w:eastAsia="Consolas" w:hAnsi="Consolas" w:cs="Consolas"/>
-          <w:sz w:val="18"/>
-          <w:szCs w:val="18"/>
-        </w:rPr>
-        <w:t>TICKS</w:t>
-      </w:r>
-      <w:proofErr w:type="spellEnd"/>
-      <w:r>
-        <w:rPr>
-          <w:rFonts w:ascii="Consolas" w:eastAsia="Consolas" w:hAnsi="Consolas" w:cs="Consolas"/>
-          <w:sz w:val="18"/>
-          <w:szCs w:val="18"/>
-        </w:rPr>
-        <w:t>(</w:t>
-      </w:r>
-      <w:proofErr w:type="gramEnd"/>
-      <w:r>
-        <w:rPr>
-          <w:rFonts w:ascii="Consolas" w:eastAsia="Consolas" w:hAnsi="Consolas" w:cs="Consolas"/>
-          <w:sz w:val="18"/>
-          <w:szCs w:val="18"/>
-        </w:rPr>
-        <w:t>500));</w:t>
+        <w:t>pdMS_TO_TICKS</w:t>
+      </w:r>
+      <w:proofErr w:type="spellEnd"/>
+      <w:r>
+        <w:rPr>
+          <w:rFonts w:ascii="Consolas" w:eastAsia="Consolas" w:hAnsi="Consolas" w:cs="Consolas"/>
+          <w:sz w:val="18"/>
+          <w:szCs w:val="18"/>
+        </w:rPr>
+        <w:t>(500));</w:t>
       </w:r>
     </w:p>
     <w:p>
@@ -2736,7 +2577,6 @@
           <w:sz w:val="18"/>
           <w:szCs w:val="18"/>
         </w:rPr>
-        <w:lastRenderedPageBreak/>
         <w:t xml:space="preserve">        </w:t>
       </w:r>
       <w:proofErr w:type="spellStart"/>
@@ -2746,34 +2586,16 @@
           <w:sz w:val="18"/>
           <w:szCs w:val="18"/>
         </w:rPr>
-        <w:t>gpio_set_</w:t>
-      </w:r>
-      <w:proofErr w:type="gramStart"/>
-      <w:r>
-        <w:rPr>
-          <w:rFonts w:ascii="Consolas" w:eastAsia="Consolas" w:hAnsi="Consolas" w:cs="Consolas"/>
-          <w:sz w:val="18"/>
-          <w:szCs w:val="18"/>
-        </w:rPr>
-        <w:t>level</w:t>
-      </w:r>
-      <w:proofErr w:type="spellEnd"/>
-      <w:r>
-        <w:rPr>
-          <w:rFonts w:ascii="Consolas" w:eastAsia="Consolas" w:hAnsi="Consolas" w:cs="Consolas"/>
-          <w:sz w:val="18"/>
-          <w:szCs w:val="18"/>
-        </w:rPr>
-        <w:t>(</w:t>
-      </w:r>
-      <w:proofErr w:type="gramEnd"/>
-      <w:r>
-        <w:rPr>
-          <w:rFonts w:ascii="Consolas" w:eastAsia="Consolas" w:hAnsi="Consolas" w:cs="Consolas"/>
-          <w:sz w:val="18"/>
-          <w:szCs w:val="18"/>
-        </w:rPr>
-        <w:t>LED_GPIO, 0);</w:t>
+        <w:t>gpio_set_level</w:t>
+      </w:r>
+      <w:proofErr w:type="spellEnd"/>
+      <w:r>
+        <w:rPr>
+          <w:rFonts w:ascii="Consolas" w:eastAsia="Consolas" w:hAnsi="Consolas" w:cs="Consolas"/>
+          <w:sz w:val="18"/>
+          <w:szCs w:val="18"/>
+        </w:rPr>
+        <w:t>(LED_GPIO, 0);</w:t>
       </w:r>
     </w:p>
     <w:p>
@@ -2818,34 +2640,16 @@
           <w:sz w:val="18"/>
           <w:szCs w:val="18"/>
         </w:rPr>
-        <w:t>pdMS_TO_</w:t>
-      </w:r>
-      <w:proofErr w:type="gramStart"/>
-      <w:r>
-        <w:rPr>
-          <w:rFonts w:ascii="Consolas" w:eastAsia="Consolas" w:hAnsi="Consolas" w:cs="Consolas"/>
-          <w:sz w:val="18"/>
-          <w:szCs w:val="18"/>
-        </w:rPr>
-        <w:t>TICKS</w:t>
-      </w:r>
-      <w:proofErr w:type="spellEnd"/>
-      <w:r>
-        <w:rPr>
-          <w:rFonts w:ascii="Consolas" w:eastAsia="Consolas" w:hAnsi="Consolas" w:cs="Consolas"/>
-          <w:sz w:val="18"/>
-          <w:szCs w:val="18"/>
-        </w:rPr>
-        <w:t>(</w:t>
-      </w:r>
-      <w:proofErr w:type="gramEnd"/>
-      <w:r>
-        <w:rPr>
-          <w:rFonts w:ascii="Consolas" w:eastAsia="Consolas" w:hAnsi="Consolas" w:cs="Consolas"/>
-          <w:sz w:val="18"/>
-          <w:szCs w:val="18"/>
-        </w:rPr>
-        <w:t>500));</w:t>
+        <w:t>pdMS_TO_TICKS</w:t>
+      </w:r>
+      <w:proofErr w:type="spellEnd"/>
+      <w:r>
+        <w:rPr>
+          <w:rFonts w:ascii="Consolas" w:eastAsia="Consolas" w:hAnsi="Consolas" w:cs="Consolas"/>
+          <w:sz w:val="18"/>
+          <w:szCs w:val="18"/>
+        </w:rPr>
+        <w:t>(500));</w:t>
       </w:r>
     </w:p>
     <w:p>
@@ -2932,12 +2736,10 @@
         <w:spacing w:line="360" w:lineRule="auto"/>
       </w:pPr>
       <w:proofErr w:type="spellStart"/>
-      <w:proofErr w:type="gramStart"/>
       <w:r>
         <w:t>wokwi.toml</w:t>
       </w:r>
       <w:proofErr w:type="spellEnd"/>
-      <w:proofErr w:type="gramEnd"/>
     </w:p>
     <w:p>
       <w:pPr>
@@ -3122,12 +2924,10 @@
         <w:spacing w:line="360" w:lineRule="auto"/>
       </w:pPr>
       <w:proofErr w:type="spellStart"/>
-      <w:proofErr w:type="gramStart"/>
       <w:r>
         <w:t>diagram.json</w:t>
       </w:r>
       <w:proofErr w:type="spellEnd"/>
-      <w:proofErr w:type="gramEnd"/>
       <w:r>
         <w:t xml:space="preserve"> (ESP32 + LED on GPIO 2)</w:t>
       </w:r>
@@ -3255,25 +3055,7 @@
           <w:sz w:val="18"/>
           <w:szCs w:val="18"/>
         </w:rPr>
-        <w:t xml:space="preserve">    </w:t>
-      </w:r>
-      <w:proofErr w:type="gramStart"/>
-      <w:r>
-        <w:rPr>
-          <w:rFonts w:ascii="Consolas" w:eastAsia="Consolas" w:hAnsi="Consolas" w:cs="Consolas"/>
-          <w:sz w:val="18"/>
-          <w:szCs w:val="18"/>
-        </w:rPr>
-        <w:t>{ "</w:t>
-      </w:r>
-      <w:proofErr w:type="gramEnd"/>
-      <w:r>
-        <w:rPr>
-          <w:rFonts w:ascii="Consolas" w:eastAsia="Consolas" w:hAnsi="Consolas" w:cs="Consolas"/>
-          <w:sz w:val="18"/>
-          <w:szCs w:val="18"/>
-        </w:rPr>
-        <w:t>type": "board-esp32-devkit-c-v4", "id": "</w:t>
+        <w:t xml:space="preserve">    { "type": "board-esp32-devkit-c-v4", "id": "</w:t>
       </w:r>
       <w:proofErr w:type="spellStart"/>
       <w:r>
@@ -3309,25 +3091,7 @@
           <w:sz w:val="18"/>
           <w:szCs w:val="18"/>
         </w:rPr>
-        <w:t>": {</w:t>
-      </w:r>
-      <w:proofErr w:type="gramStart"/>
-      <w:r>
-        <w:rPr>
-          <w:rFonts w:ascii="Consolas" w:eastAsia="Consolas" w:hAnsi="Consolas" w:cs="Consolas"/>
-          <w:sz w:val="18"/>
-          <w:szCs w:val="18"/>
-        </w:rPr>
-        <w:t>} }</w:t>
-      </w:r>
-      <w:proofErr w:type="gramEnd"/>
-      <w:r>
-        <w:rPr>
-          <w:rFonts w:ascii="Consolas" w:eastAsia="Consolas" w:hAnsi="Consolas" w:cs="Consolas"/>
-          <w:sz w:val="18"/>
-          <w:szCs w:val="18"/>
-        </w:rPr>
-        <w:t>,</w:t>
+        <w:t>": {} },</w:t>
       </w:r>
     </w:p>
     <w:p>
@@ -3345,25 +3109,7 @@
           <w:sz w:val="18"/>
           <w:szCs w:val="18"/>
         </w:rPr>
-        <w:t xml:space="preserve">    </w:t>
-      </w:r>
-      <w:proofErr w:type="gramStart"/>
-      <w:r>
-        <w:rPr>
-          <w:rFonts w:ascii="Consolas" w:eastAsia="Consolas" w:hAnsi="Consolas" w:cs="Consolas"/>
-          <w:sz w:val="18"/>
-          <w:szCs w:val="18"/>
-        </w:rPr>
-        <w:t>{ "</w:t>
-      </w:r>
-      <w:proofErr w:type="gramEnd"/>
-      <w:r>
-        <w:rPr>
-          <w:rFonts w:ascii="Consolas" w:eastAsia="Consolas" w:hAnsi="Consolas" w:cs="Consolas"/>
-          <w:sz w:val="18"/>
-          <w:szCs w:val="18"/>
-        </w:rPr>
-        <w:t>type": "</w:t>
+        <w:t xml:space="preserve">    { "type": "</w:t>
       </w:r>
       <w:proofErr w:type="spellStart"/>
       <w:r>
@@ -3399,43 +3145,7 @@
           <w:sz w:val="18"/>
           <w:szCs w:val="18"/>
         </w:rPr>
-        <w:t xml:space="preserve">": </w:t>
-      </w:r>
-      <w:proofErr w:type="gramStart"/>
-      <w:r>
-        <w:rPr>
-          <w:rFonts w:ascii="Consolas" w:eastAsia="Consolas" w:hAnsi="Consolas" w:cs="Consolas"/>
-          <w:sz w:val="18"/>
-          <w:szCs w:val="18"/>
-        </w:rPr>
-        <w:t>{ "</w:t>
-      </w:r>
-      <w:proofErr w:type="gramEnd"/>
-      <w:r>
-        <w:rPr>
-          <w:rFonts w:ascii="Consolas" w:eastAsia="Consolas" w:hAnsi="Consolas" w:cs="Consolas"/>
-          <w:sz w:val="18"/>
-          <w:szCs w:val="18"/>
-        </w:rPr>
-        <w:t>value": "220</w:t>
-      </w:r>
-      <w:proofErr w:type="gramStart"/>
-      <w:r>
-        <w:rPr>
-          <w:rFonts w:ascii="Consolas" w:eastAsia="Consolas" w:hAnsi="Consolas" w:cs="Consolas"/>
-          <w:sz w:val="18"/>
-          <w:szCs w:val="18"/>
-        </w:rPr>
-        <w:t>" }</w:t>
-      </w:r>
-      <w:proofErr w:type="gramEnd"/>
-      <w:r>
-        <w:rPr>
-          <w:rFonts w:ascii="Consolas" w:eastAsia="Consolas" w:hAnsi="Consolas" w:cs="Consolas"/>
-          <w:sz w:val="18"/>
-          <w:szCs w:val="18"/>
-        </w:rPr>
-        <w:t xml:space="preserve"> },</w:t>
+        <w:t>": { "value": "220" } },</w:t>
       </w:r>
     </w:p>
     <w:p>
@@ -3453,25 +3163,7 @@
           <w:sz w:val="18"/>
           <w:szCs w:val="18"/>
         </w:rPr>
-        <w:t xml:space="preserve">    </w:t>
-      </w:r>
-      <w:proofErr w:type="gramStart"/>
-      <w:r>
-        <w:rPr>
-          <w:rFonts w:ascii="Consolas" w:eastAsia="Consolas" w:hAnsi="Consolas" w:cs="Consolas"/>
-          <w:sz w:val="18"/>
-          <w:szCs w:val="18"/>
-        </w:rPr>
-        <w:t>{ "</w:t>
-      </w:r>
-      <w:proofErr w:type="gramEnd"/>
-      <w:r>
-        <w:rPr>
-          <w:rFonts w:ascii="Consolas" w:eastAsia="Consolas" w:hAnsi="Consolas" w:cs="Consolas"/>
-          <w:sz w:val="18"/>
-          <w:szCs w:val="18"/>
-        </w:rPr>
-        <w:t>type": "</w:t>
+        <w:t xml:space="preserve">    { "type": "</w:t>
       </w:r>
       <w:proofErr w:type="spellStart"/>
       <w:r>
@@ -3507,43 +3199,7 @@
           <w:sz w:val="18"/>
           <w:szCs w:val="18"/>
         </w:rPr>
-        <w:t xml:space="preserve">": </w:t>
-      </w:r>
-      <w:proofErr w:type="gramStart"/>
-      <w:r>
-        <w:rPr>
-          <w:rFonts w:ascii="Consolas" w:eastAsia="Consolas" w:hAnsi="Consolas" w:cs="Consolas"/>
-          <w:sz w:val="18"/>
-          <w:szCs w:val="18"/>
-        </w:rPr>
-        <w:t>{ "</w:t>
-      </w:r>
-      <w:proofErr w:type="gramEnd"/>
-      <w:r>
-        <w:rPr>
-          <w:rFonts w:ascii="Consolas" w:eastAsia="Consolas" w:hAnsi="Consolas" w:cs="Consolas"/>
-          <w:sz w:val="18"/>
-          <w:szCs w:val="18"/>
-        </w:rPr>
-        <w:t>color": "red</w:t>
-      </w:r>
-      <w:proofErr w:type="gramStart"/>
-      <w:r>
-        <w:rPr>
-          <w:rFonts w:ascii="Consolas" w:eastAsia="Consolas" w:hAnsi="Consolas" w:cs="Consolas"/>
-          <w:sz w:val="18"/>
-          <w:szCs w:val="18"/>
-        </w:rPr>
-        <w:t>" }</w:t>
-      </w:r>
-      <w:proofErr w:type="gramEnd"/>
-      <w:r>
-        <w:rPr>
-          <w:rFonts w:ascii="Consolas" w:eastAsia="Consolas" w:hAnsi="Consolas" w:cs="Consolas"/>
-          <w:sz w:val="18"/>
-          <w:szCs w:val="18"/>
-        </w:rPr>
-        <w:t xml:space="preserve"> }</w:t>
+        <w:t>": { "color": "red" } }</w:t>
       </w:r>
     </w:p>
     <w:p>
@@ -3600,7 +3256,6 @@
         <w:t xml:space="preserve">    ["</w:t>
       </w:r>
       <w:proofErr w:type="spellStart"/>
-      <w:proofErr w:type="gramStart"/>
       <w:r>
         <w:rPr>
           <w:rFonts w:ascii="Consolas" w:eastAsia="Consolas" w:hAnsi="Consolas" w:cs="Consolas"/>
@@ -3610,7 +3265,6 @@
         <w:t>esp:TX</w:t>
       </w:r>
       <w:proofErr w:type="spellEnd"/>
-      <w:proofErr w:type="gramEnd"/>
       <w:r>
         <w:rPr>
           <w:rFonts w:ascii="Consolas" w:eastAsia="Consolas" w:hAnsi="Consolas" w:cs="Consolas"/>
@@ -3620,7 +3274,6 @@
         <w:t>", "$</w:t>
       </w:r>
       <w:proofErr w:type="spellStart"/>
-      <w:proofErr w:type="gramStart"/>
       <w:r>
         <w:rPr>
           <w:rFonts w:ascii="Consolas" w:eastAsia="Consolas" w:hAnsi="Consolas" w:cs="Consolas"/>
@@ -3630,7 +3283,6 @@
         <w:t>serialMonitor:RX</w:t>
       </w:r>
       <w:proofErr w:type="spellEnd"/>
-      <w:proofErr w:type="gramEnd"/>
       <w:r>
         <w:rPr>
           <w:rFonts w:ascii="Consolas" w:eastAsia="Consolas" w:hAnsi="Consolas" w:cs="Consolas"/>
@@ -3658,7 +3310,6 @@
         <w:t xml:space="preserve">    ["</w:t>
       </w:r>
       <w:proofErr w:type="spellStart"/>
-      <w:proofErr w:type="gramStart"/>
       <w:r>
         <w:rPr>
           <w:rFonts w:ascii="Consolas" w:eastAsia="Consolas" w:hAnsi="Consolas" w:cs="Consolas"/>
@@ -3668,7 +3319,6 @@
         <w:t>esp:RX</w:t>
       </w:r>
       <w:proofErr w:type="spellEnd"/>
-      <w:proofErr w:type="gramEnd"/>
       <w:r>
         <w:rPr>
           <w:rFonts w:ascii="Consolas" w:eastAsia="Consolas" w:hAnsi="Consolas" w:cs="Consolas"/>
@@ -3678,7 +3328,6 @@
         <w:t>", "$</w:t>
       </w:r>
       <w:proofErr w:type="spellStart"/>
-      <w:proofErr w:type="gramStart"/>
       <w:r>
         <w:rPr>
           <w:rFonts w:ascii="Consolas" w:eastAsia="Consolas" w:hAnsi="Consolas" w:cs="Consolas"/>
@@ -3688,7 +3337,6 @@
         <w:t>serialMonitor:TX</w:t>
       </w:r>
       <w:proofErr w:type="spellEnd"/>
-      <w:proofErr w:type="gramEnd"/>
       <w:r>
         <w:rPr>
           <w:rFonts w:ascii="Consolas" w:eastAsia="Consolas" w:hAnsi="Consolas" w:cs="Consolas"/>
@@ -3731,25 +3379,7 @@
           <w:sz w:val="18"/>
           <w:szCs w:val="18"/>
         </w:rPr>
-        <w:t xml:space="preserve">    ["r1:2", "led</w:t>
-      </w:r>
-      <w:proofErr w:type="gramStart"/>
-      <w:r>
-        <w:rPr>
-          <w:rFonts w:ascii="Consolas" w:eastAsia="Consolas" w:hAnsi="Consolas" w:cs="Consolas"/>
-          <w:sz w:val="18"/>
-          <w:szCs w:val="18"/>
-        </w:rPr>
-        <w:t>1:A</w:t>
-      </w:r>
-      <w:proofErr w:type="gramEnd"/>
-      <w:r>
-        <w:rPr>
-          <w:rFonts w:ascii="Consolas" w:eastAsia="Consolas" w:hAnsi="Consolas" w:cs="Consolas"/>
-          <w:sz w:val="18"/>
-          <w:szCs w:val="18"/>
-        </w:rPr>
-        <w:t>", "green", []],</w:t>
+        <w:t xml:space="preserve">    ["r1:2", "led1:A", "green", []],</w:t>
       </w:r>
     </w:p>
     <w:p>
@@ -3767,25 +3397,7 @@
           <w:sz w:val="18"/>
           <w:szCs w:val="18"/>
         </w:rPr>
-        <w:t xml:space="preserve">    ["led1:C", "</w:t>
-      </w:r>
-      <w:proofErr w:type="gramStart"/>
-      <w:r>
-        <w:rPr>
-          <w:rFonts w:ascii="Consolas" w:eastAsia="Consolas" w:hAnsi="Consolas" w:cs="Consolas"/>
-          <w:sz w:val="18"/>
-          <w:szCs w:val="18"/>
-        </w:rPr>
-        <w:t>esp:GND.</w:t>
-      </w:r>
-      <w:proofErr w:type="gramEnd"/>
-      <w:r>
-        <w:rPr>
-          <w:rFonts w:ascii="Consolas" w:eastAsia="Consolas" w:hAnsi="Consolas" w:cs="Consolas"/>
-          <w:sz w:val="18"/>
-          <w:szCs w:val="18"/>
-        </w:rPr>
-        <w:t>1", "black", []]</w:t>
+        <w:t xml:space="preserve">    ["led1:C", "esp:GND.1", "black", []]</w:t>
       </w:r>
     </w:p>
     <w:p>
@@ -3834,7 +3446,6 @@
         <w:spacing w:after="120" w:line="360" w:lineRule="auto"/>
       </w:pPr>
       <w:r>
-        <w:lastRenderedPageBreak/>
         <w:t xml:space="preserve">The GPIO in your code must match the pin in the diagram: </w:t>
       </w:r>
       <w:r>
@@ -3898,12 +3509,6 @@
         <w:gridCol w:w="4338"/>
       </w:tblGrid>
       <w:tr>
-        <w:tblPrEx>
-          <w:tblCellMar>
-            <w:top w:w="0" w:type="dxa"/>
-            <w:bottom w:w="0" w:type="dxa"/>
-          </w:tblCellMar>
-        </w:tblPrEx>
         <w:trPr>
           <w:tblHeader/>
         </w:trPr>
@@ -4025,12 +3630,6 @@
         </w:tc>
       </w:tr>
       <w:tr>
-        <w:tblPrEx>
-          <w:tblCellMar>
-            <w:top w:w="0" w:type="dxa"/>
-            <w:bottom w:w="0" w:type="dxa"/>
-          </w:tblCellMar>
-        </w:tblPrEx>
         <w:tc>
           <w:tcPr>
             <w:tcW w:w="2300" w:type="dxa"/>
@@ -4132,12 +3731,6 @@
         </w:tc>
       </w:tr>
       <w:tr>
-        <w:tblPrEx>
-          <w:tblCellMar>
-            <w:top w:w="0" w:type="dxa"/>
-            <w:bottom w:w="0" w:type="dxa"/>
-          </w:tblCellMar>
-        </w:tblPrEx>
         <w:tc>
           <w:tcPr>
             <w:tcW w:w="2300" w:type="dxa"/>
@@ -4257,12 +3850,6 @@
         </w:tc>
       </w:tr>
       <w:tr>
-        <w:tblPrEx>
-          <w:tblCellMar>
-            <w:top w:w="0" w:type="dxa"/>
-            <w:bottom w:w="0" w:type="dxa"/>
-          </w:tblCellMar>
-        </w:tblPrEx>
         <w:tc>
           <w:tcPr>
             <w:tcW w:w="2300" w:type="dxa"/>
@@ -4364,12 +3951,6 @@
         </w:tc>
       </w:tr>
       <w:tr>
-        <w:tblPrEx>
-          <w:tblCellMar>
-            <w:top w:w="0" w:type="dxa"/>
-            <w:bottom w:w="0" w:type="dxa"/>
-          </w:tblCellMar>
-        </w:tblPrEx>
         <w:tc>
           <w:tcPr>
             <w:tcW w:w="2300" w:type="dxa"/>
@@ -4481,12 +4062,6 @@
         </w:tc>
       </w:tr>
       <w:tr>
-        <w:tblPrEx>
-          <w:tblCellMar>
-            <w:top w:w="0" w:type="dxa"/>
-            <w:bottom w:w="0" w:type="dxa"/>
-          </w:tblCellMar>
-        </w:tblPrEx>
         <w:tc>
           <w:tcPr>
             <w:tcW w:w="2300" w:type="dxa"/>
@@ -4598,12 +4173,6 @@
         </w:tc>
       </w:tr>
       <w:tr>
-        <w:tblPrEx>
-          <w:tblCellMar>
-            <w:top w:w="0" w:type="dxa"/>
-            <w:bottom w:w="0" w:type="dxa"/>
-          </w:tblCellMar>
-        </w:tblPrEx>
         <w:tc>
           <w:tcPr>
             <w:tcW w:w="2300" w:type="dxa"/>
@@ -4705,12 +4274,6 @@
         </w:tc>
       </w:tr>
       <w:tr>
-        <w:tblPrEx>
-          <w:tblCellMar>
-            <w:top w:w="0" w:type="dxa"/>
-            <w:bottom w:w="0" w:type="dxa"/>
-          </w:tblCellMar>
-        </w:tblPrEx>
         <w:tc>
           <w:tcPr>
             <w:tcW w:w="2300" w:type="dxa"/>
@@ -4812,12 +4375,6 @@
         </w:tc>
       </w:tr>
       <w:tr>
-        <w:tblPrEx>
-          <w:tblCellMar>
-            <w:top w:w="0" w:type="dxa"/>
-            <w:bottom w:w="0" w:type="dxa"/>
-          </w:tblCellMar>
-        </w:tblPrEx>
         <w:tc>
           <w:tcPr>
             <w:tcW w:w="2300" w:type="dxa"/>
@@ -4909,12 +4466,6 @@
         </w:tc>
       </w:tr>
       <w:tr>
-        <w:tblPrEx>
-          <w:tblCellMar>
-            <w:top w:w="0" w:type="dxa"/>
-            <w:bottom w:w="0" w:type="dxa"/>
-          </w:tblCellMar>
-        </w:tblPrEx>
         <w:tc>
           <w:tcPr>
             <w:tcW w:w="2300" w:type="dxa"/>
@@ -5016,12 +4567,6 @@
         </w:tc>
       </w:tr>
       <w:tr>
-        <w:tblPrEx>
-          <w:tblCellMar>
-            <w:top w:w="0" w:type="dxa"/>
-            <w:bottom w:w="0" w:type="dxa"/>
-          </w:tblCellMar>
-        </w:tblPrEx>
         <w:tc>
           <w:tcPr>
             <w:tcW w:w="2300" w:type="dxa"/>
@@ -5113,12 +4658,6 @@
         </w:tc>
       </w:tr>
       <w:tr>
-        <w:tblPrEx>
-          <w:tblCellMar>
-            <w:top w:w="0" w:type="dxa"/>
-            <w:bottom w:w="0" w:type="dxa"/>
-          </w:tblCellMar>
-        </w:tblPrEx>
         <w:tc>
           <w:tcPr>
             <w:tcW w:w="2300" w:type="dxa"/>
@@ -5396,6 +4935,7 @@
         <w:spacing w:after="120" w:line="360" w:lineRule="auto"/>
       </w:pPr>
       <w:r>
+        <w:lastRenderedPageBreak/>
         <w:t xml:space="preserve">The first build compiles all of ESP-IDF and takes a few minutes. After that, builds are incremental and take seconds. A full rebuild happens only after </w:t>
       </w:r>
       <w:r>
@@ -5457,7 +4997,6 @@
       </w:pPr>
       <w:proofErr w:type="spellStart"/>
       <w:r>
-        <w:lastRenderedPageBreak/>
         <w:t>Wokwi</w:t>
       </w:r>
       <w:proofErr w:type="spellEnd"/>
@@ -5637,7 +5176,6 @@
         <w:t xml:space="preserve">Add </w:t>
       </w:r>
       <w:proofErr w:type="spellStart"/>
-      <w:proofErr w:type="gramStart"/>
       <w:r>
         <w:rPr>
           <w:rFonts w:ascii="Consolas" w:eastAsia="Consolas" w:hAnsi="Consolas" w:cs="Consolas"/>
@@ -5648,7 +5186,6 @@
         <w:t>wokwi.toml</w:t>
       </w:r>
       <w:proofErr w:type="spellEnd"/>
-      <w:proofErr w:type="gramEnd"/>
       <w:r>
         <w:t>, with the ELF name matching the project name.</w:t>
       </w:r>
@@ -5666,7 +5203,6 @@
         <w:t xml:space="preserve">Add </w:t>
       </w:r>
       <w:proofErr w:type="spellStart"/>
-      <w:proofErr w:type="gramStart"/>
       <w:r>
         <w:rPr>
           <w:rFonts w:ascii="Consolas" w:eastAsia="Consolas" w:hAnsi="Consolas" w:cs="Consolas"/>
@@ -5677,7 +5213,6 @@
         <w:t>diagram.json</w:t>
       </w:r>
       <w:proofErr w:type="spellEnd"/>
-      <w:proofErr w:type="gramEnd"/>
       <w:r>
         <w:t>, with the LED pin matching the GPIO in the code.</w:t>
       </w:r>
@@ -5742,12 +5277,6 @@
         <w:gridCol w:w="6238"/>
       </w:tblGrid>
       <w:tr>
-        <w:tblPrEx>
-          <w:tblCellMar>
-            <w:top w:w="0" w:type="dxa"/>
-            <w:bottom w:w="0" w:type="dxa"/>
-          </w:tblCellMar>
-        </w:tblPrEx>
         <w:trPr>
           <w:tblHeader/>
         </w:trPr>
@@ -5817,12 +5346,6 @@
         </w:tc>
       </w:tr>
       <w:tr>
-        <w:tblPrEx>
-          <w:tblCellMar>
-            <w:top w:w="0" w:type="dxa"/>
-            <w:bottom w:w="0" w:type="dxa"/>
-          </w:tblCellMar>
-        </w:tblPrEx>
         <w:tc>
           <w:tcPr>
             <w:tcW w:w="3400" w:type="dxa"/>
@@ -5908,12 +5431,6 @@
         </w:tc>
       </w:tr>
       <w:tr>
-        <w:tblPrEx>
-          <w:tblCellMar>
-            <w:top w:w="0" w:type="dxa"/>
-            <w:bottom w:w="0" w:type="dxa"/>
-          </w:tblCellMar>
-        </w:tblPrEx>
         <w:tc>
           <w:tcPr>
             <w:tcW w:w="3400" w:type="dxa"/>
@@ -6042,12 +5559,6 @@
         </w:tc>
       </w:tr>
       <w:tr>
-        <w:tblPrEx>
-          <w:tblCellMar>
-            <w:top w:w="0" w:type="dxa"/>
-            <w:bottom w:w="0" w:type="dxa"/>
-          </w:tblCellMar>
-        </w:tblPrEx>
         <w:tc>
           <w:tcPr>
             <w:tcW w:w="3400" w:type="dxa"/>
@@ -6114,7 +5625,6 @@
               <w:t xml:space="preserve">The build has not finished, or the paths in </w:t>
             </w:r>
             <w:proofErr w:type="spellStart"/>
-            <w:proofErr w:type="gramStart"/>
             <w:r>
               <w:rPr>
                 <w:rFonts w:ascii="Consolas" w:eastAsia="Consolas" w:hAnsi="Consolas" w:cs="Consolas"/>
@@ -6125,7 +5635,6 @@
               <w:t>wokwi.toml</w:t>
             </w:r>
             <w:proofErr w:type="spellEnd"/>
-            <w:proofErr w:type="gramEnd"/>
             <w:r>
               <w:rPr>
                 <w:sz w:val="20"/>
@@ -6137,12 +5646,6 @@
         </w:tc>
       </w:tr>
       <w:tr>
-        <w:tblPrEx>
-          <w:tblCellMar>
-            <w:top w:w="0" w:type="dxa"/>
-            <w:bottom w:w="0" w:type="dxa"/>
-          </w:tblCellMar>
-        </w:tblPrEx>
         <w:tc>
           <w:tcPr>
             <w:tcW w:w="3400" w:type="dxa"/>
@@ -6221,12 +5724,6 @@
         </w:tc>
       </w:tr>
       <w:tr>
-        <w:tblPrEx>
-          <w:tblCellMar>
-            <w:top w:w="0" w:type="dxa"/>
-            <w:bottom w:w="0" w:type="dxa"/>
-          </w:tblCellMar>
-        </w:tblPrEx>
         <w:tc>
           <w:tcPr>
             <w:tcW w:w="3400" w:type="dxa"/>
@@ -6284,7 +5781,6 @@
               <w:t xml:space="preserve">The GPIO in the code differs from the pin wired in </w:t>
             </w:r>
             <w:proofErr w:type="spellStart"/>
-            <w:proofErr w:type="gramStart"/>
             <w:r>
               <w:rPr>
                 <w:rFonts w:ascii="Consolas" w:eastAsia="Consolas" w:hAnsi="Consolas" w:cs="Consolas"/>
@@ -6295,7 +5791,6 @@
               <w:t>diagram.json</w:t>
             </w:r>
             <w:proofErr w:type="spellEnd"/>
-            <w:proofErr w:type="gramEnd"/>
             <w:r>
               <w:rPr>
                 <w:sz w:val="20"/>
@@ -6307,12 +5802,6 @@
         </w:tc>
       </w:tr>
       <w:tr>
-        <w:tblPrEx>
-          <w:tblCellMar>
-            <w:top w:w="0" w:type="dxa"/>
-            <w:bottom w:w="0" w:type="dxa"/>
-          </w:tblCellMar>
-        </w:tblPrEx>
         <w:tc>
           <w:tcPr>
             <w:tcW w:w="3400" w:type="dxa"/>
@@ -6420,12 +5909,6 @@
         </w:tc>
       </w:tr>
       <w:tr>
-        <w:tblPrEx>
-          <w:tblCellMar>
-            <w:top w:w="0" w:type="dxa"/>
-            <w:bottom w:w="0" w:type="dxa"/>
-          </w:tblCellMar>
-        </w:tblPrEx>
         <w:tc>
           <w:tcPr>
             <w:tcW w:w="3400" w:type="dxa"/>
@@ -6486,12 +5969,6 @@
         </w:tc>
       </w:tr>
       <w:tr>
-        <w:tblPrEx>
-          <w:tblCellMar>
-            <w:top w:w="0" w:type="dxa"/>
-            <w:bottom w:w="0" w:type="dxa"/>
-          </w:tblCellMar>
-        </w:tblPrEx>
         <w:tc>
           <w:tcPr>
             <w:tcW w:w="3400" w:type="dxa"/>
@@ -6615,25 +6092,7 @@
         <w:sz w:val="18"/>
         <w:szCs w:val="18"/>
       </w:rPr>
-      <w:t xml:space="preserve">ESP32 Project Setup </w:t>
-    </w:r>
-    <w:proofErr w:type="gramStart"/>
-    <w:r>
-      <w:rPr>
-        <w:color w:val="7F7F7F"/>
-        <w:sz w:val="18"/>
-        <w:szCs w:val="18"/>
-      </w:rPr>
-      <w:t>Guide  |</w:t>
-    </w:r>
-    <w:proofErr w:type="gramEnd"/>
-    <w:r>
-      <w:rPr>
-        <w:color w:val="7F7F7F"/>
-        <w:sz w:val="18"/>
-        <w:szCs w:val="18"/>
-      </w:rPr>
-      <w:t xml:space="preserve">  Page </w:t>
+      <w:t xml:space="preserve">ESP32 Project Setup Guide  |  Page </w:t>
     </w:r>
     <w:r>
       <w:rPr>

</xml_diff>